<commit_message>
Update Functional-NonFunctional Requirement and UserRequirements
</commit_message>
<xml_diff>
--- a/Documentation/Analysis/Requirements Analysis/Concept Version/Functional-NonFunctional Requirement - W.docx
+++ b/Documentation/Analysis/Requirements Analysis/Concept Version/Functional-NonFunctional Requirement - W.docx
@@ -424,7 +424,6 @@
                 <w:bCs/>
                 <w:sz w:val="28"/>
                 <w:szCs w:val="28"/>
-                <w:rtl/>
               </w:rPr>
             </w:pPr>
             <w:r>
@@ -468,6 +467,36 @@
                 <w:szCs w:val="28"/>
               </w:rPr>
               <w:t>.</w:t>
+            </w:r>
+          </w:p>
+          <w:p>
+            <w:pPr>
+              <w:pStyle w:val="ListParagraph"/>
+              <w:numPr>
+                <w:ilvl w:val="0"/>
+                <w:numId w:val="12"/>
+              </w:numPr>
+              <w:bidi/>
+              <w:rPr>
+                <w:rFonts w:cs="Mj_Casablanca Light"/>
+                <w:b/>
+                <w:bCs/>
+                <w:sz w:val="28"/>
+                <w:szCs w:val="28"/>
+                <w:rtl/>
+              </w:rPr>
+            </w:pPr>
+            <w:r>
+              <w:rPr>
+                <w:rFonts w:cs="Mj_Casablanca Light" w:hint="cs"/>
+                <w:b/>
+                <w:bCs/>
+                <w:sz w:val="28"/>
+                <w:szCs w:val="28"/>
+                <w:rtl/>
+                <w:lang w:bidi="fa-IR"/>
+              </w:rPr>
+              <w:t>توانايي اعمال تخفيف براي نوبت ها</w:t>
             </w:r>
           </w:p>
         </w:tc>
@@ -876,7 +905,6 @@
                 <w:bCs/>
                 <w:sz w:val="28"/>
                 <w:szCs w:val="28"/>
-                <w:rtl/>
               </w:rPr>
             </w:pPr>
             <w:r>
@@ -899,6 +927,48 @@
                 <w:szCs w:val="28"/>
               </w:rPr>
               <w:t>.</w:t>
+            </w:r>
+          </w:p>
+          <w:p>
+            <w:pPr>
+              <w:pStyle w:val="ListParagraph"/>
+              <w:numPr>
+                <w:ilvl w:val="0"/>
+                <w:numId w:val="12"/>
+              </w:numPr>
+              <w:bidi/>
+              <w:rPr>
+                <w:rFonts w:cs="Mj_Casablanca Light"/>
+                <w:b/>
+                <w:bCs/>
+                <w:sz w:val="28"/>
+                <w:szCs w:val="28"/>
+                <w:rtl/>
+              </w:rPr>
+            </w:pPr>
+            <w:r>
+              <w:rPr>
+                <w:rFonts w:cs="Mj_Casablanca Light" w:hint="cs"/>
+                <w:b/>
+                <w:bCs/>
+                <w:sz w:val="28"/>
+                <w:szCs w:val="28"/>
+                <w:rtl/>
+                <w:lang w:bidi="fa-IR"/>
+              </w:rPr>
+              <w:t xml:space="preserve">توانايي اعمال تخفيف </w:t>
+            </w:r>
+            <w:r>
+              <w:rPr>
+                <w:rFonts w:cs="Mj_Casablanca Light" w:hint="cs"/>
+                <w:b/>
+                <w:bCs/>
+                <w:sz w:val="28"/>
+                <w:szCs w:val="28"/>
+                <w:rtl/>
+                <w:lang w:bidi="fa-IR"/>
+              </w:rPr>
+              <w:t>براي اخذ نوبت</w:t>
             </w:r>
           </w:p>
         </w:tc>
@@ -1632,7 +1702,6 @@
                 <w:bCs/>
                 <w:sz w:val="28"/>
                 <w:szCs w:val="28"/>
-                <w:rtl/>
               </w:rPr>
             </w:pPr>
             <w:r>
@@ -1655,6 +1724,36 @@
                 <w:szCs w:val="28"/>
               </w:rPr>
               <w:t>.</w:t>
+            </w:r>
+          </w:p>
+          <w:p>
+            <w:pPr>
+              <w:pStyle w:val="ListParagraph"/>
+              <w:numPr>
+                <w:ilvl w:val="0"/>
+                <w:numId w:val="12"/>
+              </w:numPr>
+              <w:bidi/>
+              <w:rPr>
+                <w:rFonts w:cs="Mj_Casablanca Light"/>
+                <w:b/>
+                <w:bCs/>
+                <w:sz w:val="28"/>
+                <w:szCs w:val="28"/>
+                <w:rtl/>
+              </w:rPr>
+            </w:pPr>
+            <w:r>
+              <w:rPr>
+                <w:rFonts w:cs="Mj_Casablanca Light" w:hint="cs"/>
+                <w:b/>
+                <w:bCs/>
+                <w:sz w:val="28"/>
+                <w:szCs w:val="28"/>
+                <w:rtl/>
+                <w:lang w:bidi="fa-IR"/>
+              </w:rPr>
+              <w:t>توانايي اعمال تخفيف براي نوبت ها</w:t>
             </w:r>
           </w:p>
         </w:tc>
@@ -2597,7 +2696,7 @@
         <v:path o:extrusionok="f" gradientshapeok="t" o:connecttype="rect"/>
         <o:lock v:ext="edit" aspectratio="t"/>
       </v:shapetype>
-      <v:shape id="_x0000_i1025" type="#_x0000_t75" style="width:11.4pt;height:11.4pt" o:bullet="t">
+      <v:shape id="_x0000_i1025" type="#_x0000_t75" style="width:11.25pt;height:11.25pt" o:bullet="t">
         <v:imagedata r:id="rId1" o:title="mso3BF"/>
       </v:shape>
     </w:pict>

</xml_diff>